<commit_message>
add Sure v0.7.5 release to portfolio and resume
Co-Authored-By: Claude Opus 5.5 (1M context) <noreply@anthropic.com>
</commit_message>
<xml_diff>
--- a/src/resume/resume.docx
+++ b/src/resume/resume.docx
@@ -7,6 +7,9 @@
         <w:pStyle w:val="Title"/>
       </w:pPr>
       <w:r>
+        <w:rPr>
+          <w:lang w:val="en"/>
+        </w:rPr>
         <w:t xml:space="preserve">William Wei Ming — Resume</w:t>
       </w:r>
     </w:p>
@@ -16,6 +19,9 @@
         <w:pStyle w:val="Heading1"/>
       </w:pPr>
       <w:r>
+        <w:rPr>
+          <w:lang w:val="en"/>
+        </w:rPr>
         <w:t xml:space="preserve">William Wei Ming</w:t>
       </w:r>
     </w:p>
@@ -24,6 +30,9 @@
         <w:pStyle w:val="FirstParagraph"/>
       </w:pPr>
       <w:r>
+        <w:rPr>
+          <w:lang w:val="en"/>
+        </w:rPr>
         <w:t xml:space="preserve">Senior Full-Stack Engineer | AI Backend | Open Source Miner</w:t>
       </w:r>
     </w:p>
@@ -33,21 +42,34 @@
         <w:pStyle w:val="BodyText"/>
       </w:pPr>
       <w:r>
+        <w:rPr>
+          <w:lang w:val="en"/>
+        </w:rPr>
         <w:t xml:space="preserve">Website</w:t>
       </w:r>
       <w:r>
+        <w:rPr>
+          <w:lang w:val="en"/>
+        </w:rPr>
         <w:t xml:space="preserve"> </w:t>
       </w:r>
       <w:r>
+        <w:rPr>
+          <w:lang w:val="en"/>
+        </w:rPr>
         <w:t xml:space="preserve">:</w:t>
       </w:r>
       <w:r>
+        <w:rPr>
+          <w:lang w:val="en"/>
+        </w:rPr>
         <w:t xml:space="preserve"> </w:t>
       </w:r>
       <w:hyperlink r:id="rId10">
         <w:r>
           <w:rPr>
             <w:rStyle w:val="Hyperlink"/>
+            <w:lang w:val="en"/>
           </w:rPr>
           <w:t xml:space="preserve">https://williamweiming.com</w:t>
         </w:r>
@@ -58,21 +80,34 @@
         <w:pStyle w:val="BodyText"/>
       </w:pPr>
       <w:r>
+        <w:rPr>
+          <w:lang w:val="en"/>
+        </w:rPr>
         <w:t xml:space="preserve">Email</w:t>
       </w:r>
       <w:r>
+        <w:rPr>
+          <w:lang w:val="en"/>
+        </w:rPr>
         <w:t xml:space="preserve"> </w:t>
       </w:r>
       <w:r>
+        <w:rPr>
+          <w:lang w:val="en"/>
+        </w:rPr>
         <w:t xml:space="preserve">:</w:t>
       </w:r>
       <w:r>
+        <w:rPr>
+          <w:lang w:val="en"/>
+        </w:rPr>
         <w:t xml:space="preserve"> </w:t>
       </w:r>
       <w:hyperlink r:id="rId11">
         <w:r>
           <w:rPr>
             <w:rStyle w:val="Hyperlink"/>
+            <w:lang w:val="en"/>
           </w:rPr>
           <w:t xml:space="preserve">weimingwilliam6@gmail.com</w:t>
         </w:r>
@@ -83,21 +118,34 @@
         <w:pStyle w:val="BodyText"/>
       </w:pPr>
       <w:r>
+        <w:rPr>
+          <w:lang w:val="en"/>
+        </w:rPr>
         <w:t xml:space="preserve">GitHub</w:t>
       </w:r>
       <w:r>
+        <w:rPr>
+          <w:lang w:val="en"/>
+        </w:rPr>
         <w:t xml:space="preserve"> </w:t>
       </w:r>
       <w:r>
+        <w:rPr>
+          <w:lang w:val="en"/>
+        </w:rPr>
         <w:t xml:space="preserve">:</w:t>
       </w:r>
       <w:r>
+        <w:rPr>
+          <w:lang w:val="en"/>
+        </w:rPr>
         <w:t xml:space="preserve"> </w:t>
       </w:r>
       <w:hyperlink r:id="rId12">
         <w:r>
           <w:rPr>
             <w:rStyle w:val="Hyperlink"/>
+            <w:lang w:val="en"/>
           </w:rPr>
           <w:t xml:space="preserve">https://github.com/bittensorrider</w:t>
         </w:r>
@@ -108,21 +156,34 @@
         <w:pStyle w:val="BodyText"/>
       </w:pPr>
       <w:r>
+        <w:rPr>
+          <w:lang w:val="en"/>
+        </w:rPr>
         <w:t xml:space="preserve">LinkedIn</w:t>
       </w:r>
       <w:r>
+        <w:rPr>
+          <w:lang w:val="en"/>
+        </w:rPr>
         <w:t xml:space="preserve"> </w:t>
       </w:r>
       <w:r>
+        <w:rPr>
+          <w:lang w:val="en"/>
+        </w:rPr>
         <w:t xml:space="preserve">:</w:t>
       </w:r>
       <w:r>
+        <w:rPr>
+          <w:lang w:val="en"/>
+        </w:rPr>
         <w:t xml:space="preserve"> </w:t>
       </w:r>
       <w:hyperlink r:id="rId13">
         <w:r>
           <w:rPr>
             <w:rStyle w:val="Hyperlink"/>
+            <w:lang w:val="en"/>
           </w:rPr>
           <w:t xml:space="preserve">https://www.linkedin.com/in/william-ming-476240419</w:t>
         </w:r>
@@ -144,6 +205,9 @@
         </w:numPr>
       </w:pPr>
       <w:r>
+        <w:rPr>
+          <w:lang w:val="en"/>
+        </w:rPr>
         <w:t xml:space="preserve">Backend Developer &amp; AI Engineer · 8+ Years</w:t>
       </w:r>
     </w:p>
@@ -156,6 +220,9 @@
         </w:numPr>
       </w:pPr>
       <w:r>
+        <w:rPr>
+          <w:lang w:val="en"/>
+        </w:rPr>
         <w:t xml:space="preserve">Microservices, REST APIs &amp; Distributed Systems</w:t>
       </w:r>
     </w:p>
@@ -168,6 +235,9 @@
         </w:numPr>
       </w:pPr>
       <w:r>
+        <w:rPr>
+          <w:lang w:val="en"/>
+        </w:rPr>
         <w:t xml:space="preserve">Cloud-Native Apps with Python, Java &amp; Node.js</w:t>
       </w:r>
     </w:p>
@@ -180,6 +250,9 @@
         </w:numPr>
       </w:pPr>
       <w:r>
+        <w:rPr>
+          <w:lang w:val="en"/>
+        </w:rPr>
         <w:t xml:space="preserve">LLM Integration, RAG &amp; Vector Databases</w:t>
       </w:r>
     </w:p>
@@ -192,6 +265,9 @@
         </w:numPr>
       </w:pPr>
       <w:r>
+        <w:rPr>
+          <w:lang w:val="en"/>
+        </w:rPr>
         <w:t xml:space="preserve">Generative AI &amp; Intelligent Automation</w:t>
       </w:r>
     </w:p>
@@ -204,6 +280,9 @@
         </w:numPr>
       </w:pPr>
       <w:r>
+        <w:rPr>
+          <w:lang w:val="en"/>
+        </w:rPr>
         <w:t xml:space="preserve">Secure, Scalable &amp; Maintainable Solutions</w:t>
       </w:r>
     </w:p>
@@ -216,6 +295,9 @@
         </w:numPr>
       </w:pPr>
       <w:r>
+        <w:rPr>
+          <w:lang w:val="en"/>
+        </w:rPr>
         <w:t xml:space="preserve">Lead Projects from Concept to Production</w:t>
       </w:r>
     </w:p>
@@ -228,6 +310,9 @@
         </w:numPr>
       </w:pPr>
       <w:r>
+        <w:rPr>
+          <w:lang w:val="en"/>
+        </w:rPr>
         <w:t xml:space="preserve">Open Source Miner · Remote Contractor</w:t>
       </w:r>
     </w:p>
@@ -240,6 +325,9 @@
         </w:numPr>
       </w:pPr>
       <w:r>
+        <w:rPr>
+          <w:lang w:val="en"/>
+        </w:rPr>
         <w:t xml:space="preserve">Based in Selangor, Malaysia</w:t>
       </w:r>
     </w:p>
@@ -256,6 +344,9 @@
         <w:pStyle w:val="Heading2"/>
       </w:pPr>
       <w:r>
+        <w:rPr>
+          <w:lang w:val="en"/>
+        </w:rPr>
         <w:t xml:space="preserve">SKILLS</w:t>
       </w:r>
     </w:p>
@@ -272,6 +363,9 @@
         <w:pStyle w:val="Heading3"/>
       </w:pPr>
       <w:r>
+        <w:rPr>
+          <w:lang w:val="en"/>
+        </w:rPr>
         <w:t xml:space="preserve">Mobile / Desktop Apps</w:t>
       </w:r>
     </w:p>
@@ -284,6 +378,9 @@
         </w:numPr>
       </w:pPr>
       <w:r>
+        <w:rPr>
+          <w:lang w:val="en"/>
+        </w:rPr>
         <w:t xml:space="preserve">Android, Java, Kotlin</w:t>
       </w:r>
     </w:p>
@@ -296,6 +393,9 @@
         </w:numPr>
       </w:pPr>
       <w:r>
+        <w:rPr>
+          <w:lang w:val="en"/>
+        </w:rPr>
         <w:t xml:space="preserve">iOS, Swift</w:t>
       </w:r>
     </w:p>
@@ -308,6 +408,9 @@
         </w:numPr>
       </w:pPr>
       <w:r>
+        <w:rPr>
+          <w:lang w:val="en"/>
+        </w:rPr>
         <w:t xml:space="preserve">React Native, Ionic Framework, Flutter, Dart, Electron</w:t>
       </w:r>
     </w:p>
@@ -320,6 +423,9 @@
         </w:numPr>
       </w:pPr>
       <w:r>
+        <w:rPr>
+          <w:lang w:val="en"/>
+        </w:rPr>
         <w:t xml:space="preserve">C++, C#</w:t>
       </w:r>
     </w:p>
@@ -330,6 +436,9 @@
         <w:pStyle w:val="Heading3"/>
       </w:pPr>
       <w:r>
+        <w:rPr>
+          <w:lang w:val="en"/>
+        </w:rPr>
         <w:t xml:space="preserve">Web</w:t>
       </w:r>
     </w:p>
@@ -342,6 +451,9 @@
         </w:numPr>
       </w:pPr>
       <w:r>
+        <w:rPr>
+          <w:lang w:val="en"/>
+        </w:rPr>
         <w:t xml:space="preserve">React, Next.js, Vue, Nuxt.js, Tailwind CSS</w:t>
       </w:r>
     </w:p>
@@ -354,6 +466,9 @@
         </w:numPr>
       </w:pPr>
       <w:r>
+        <w:rPr>
+          <w:lang w:val="en"/>
+        </w:rPr>
         <w:t xml:space="preserve">Laravel, CodeIgniter, WordPress, Magento 2</w:t>
       </w:r>
     </w:p>
@@ -366,6 +481,9 @@
         </w:numPr>
       </w:pPr>
       <w:r>
+        <w:rPr>
+          <w:lang w:val="en"/>
+        </w:rPr>
         <w:t xml:space="preserve">Django, Flask, FastAPI, SpringBoot, REST APIs</w:t>
       </w:r>
     </w:p>
@@ -378,6 +496,9 @@
         </w:numPr>
       </w:pPr>
       <w:r>
+        <w:rPr>
+          <w:lang w:val="en"/>
+        </w:rPr>
         <w:t xml:space="preserve">AWS, Firebase, Supabase, n8n</w:t>
       </w:r>
     </w:p>
@@ -390,6 +511,9 @@
         </w:numPr>
       </w:pPr>
       <w:r>
+        <w:rPr>
+          <w:lang w:val="en"/>
+        </w:rPr>
         <w:t xml:space="preserve">PostgreSQL, MySQL, MongoDB, Redis</w:t>
       </w:r>
     </w:p>
@@ -402,6 +526,9 @@
         </w:numPr>
       </w:pPr>
       <w:r>
+        <w:rPr>
+          <w:lang w:val="en"/>
+        </w:rPr>
         <w:t xml:space="preserve">Docker, Kubernetes, Cloudflare, Nginx</w:t>
       </w:r>
     </w:p>
@@ -414,6 +541,9 @@
         </w:numPr>
       </w:pPr>
       <w:r>
+        <w:rPr>
+          <w:lang w:val="en"/>
+        </w:rPr>
         <w:t xml:space="preserve">Web3, DeFi, Cryptocurrency</w:t>
       </w:r>
     </w:p>
@@ -424,6 +554,9 @@
         <w:pStyle w:val="Heading3"/>
       </w:pPr>
       <w:r>
+        <w:rPr>
+          <w:lang w:val="en"/>
+        </w:rPr>
         <w:t xml:space="preserve">Artificial Intelligence</w:t>
       </w:r>
     </w:p>
@@ -439,10 +572,14 @@
         <w:rPr>
           <w:b/>
           <w:bCs/>
+          <w:lang w:val="en"/>
         </w:rPr>
         <w:t xml:space="preserve">Bittensor</w:t>
       </w:r>
       <w:r>
+        <w:rPr>
+          <w:lang w:val="en"/>
+        </w:rPr>
         <w:t xml:space="preserve">, PyTorch, TensorFlow, Keras, YOLO</w:t>
       </w:r>
     </w:p>
@@ -455,6 +592,9 @@
         </w:numPr>
       </w:pPr>
       <w:r>
+        <w:rPr>
+          <w:lang w:val="en"/>
+        </w:rPr>
         <w:t xml:space="preserve">Hugging Face, LLM, RAG, Rasa</w:t>
       </w:r>
     </w:p>
@@ -467,6 +607,9 @@
         </w:numPr>
       </w:pPr>
       <w:r>
+        <w:rPr>
+          <w:lang w:val="en"/>
+        </w:rPr>
         <w:t xml:space="preserve">LangChain, LangGraph, LlamaIndex</w:t>
       </w:r>
     </w:p>
@@ -479,6 +622,9 @@
         </w:numPr>
       </w:pPr>
       <w:r>
+        <w:rPr>
+          <w:lang w:val="en"/>
+        </w:rPr>
         <w:t xml:space="preserve">Vector Databases, pgvector, PostgreSQL</w:t>
       </w:r>
     </w:p>
@@ -491,6 +637,9 @@
         </w:numPr>
       </w:pPr>
       <w:r>
+        <w:rPr>
+          <w:lang w:val="en"/>
+        </w:rPr>
         <w:t xml:space="preserve">Prompt Engineering, Prompt Injection, Loop Engineering</w:t>
       </w:r>
     </w:p>
@@ -503,6 +652,9 @@
         </w:numPr>
       </w:pPr>
       <w:r>
+        <w:rPr>
+          <w:lang w:val="en"/>
+        </w:rPr>
         <w:t xml:space="preserve">Anthropic, Claude, OpenAI, Gemini, Mistral, Ollama</w:t>
       </w:r>
     </w:p>
@@ -515,6 +667,9 @@
         </w:numPr>
       </w:pPr>
       <w:r>
+        <w:rPr>
+          <w:lang w:val="en"/>
+        </w:rPr>
         <w:t xml:space="preserve">FastAPI, gRPC</w:t>
       </w:r>
     </w:p>
@@ -525,6 +680,9 @@
         <w:pStyle w:val="Heading3"/>
       </w:pPr>
       <w:r>
+        <w:rPr>
+          <w:lang w:val="en"/>
+        </w:rPr>
         <w:t xml:space="preserve">Tools</w:t>
       </w:r>
     </w:p>
@@ -537,6 +695,9 @@
         </w:numPr>
       </w:pPr>
       <w:r>
+        <w:rPr>
+          <w:lang w:val="en"/>
+        </w:rPr>
         <w:t xml:space="preserve">Cursor, Claude, VS Code, Visual Studio</w:t>
       </w:r>
     </w:p>
@@ -549,6 +710,9 @@
         </w:numPr>
       </w:pPr>
       <w:r>
+        <w:rPr>
+          <w:lang w:val="en"/>
+        </w:rPr>
         <w:t xml:space="preserve">Android Studio, Xcode</w:t>
       </w:r>
     </w:p>
@@ -561,6 +725,9 @@
         </w:numPr>
       </w:pPr>
       <w:r>
+        <w:rPr>
+          <w:lang w:val="en"/>
+        </w:rPr>
         <w:t xml:space="preserve">Docker Desktop, Postman, Google Chrome</w:t>
       </w:r>
     </w:p>
@@ -573,6 +740,9 @@
         </w:numPr>
       </w:pPr>
       <w:r>
+        <w:rPr>
+          <w:lang w:val="en"/>
+        </w:rPr>
         <w:t xml:space="preserve">Figma, Adobe Photoshop, Git, Vercel</w:t>
       </w:r>
     </w:p>
@@ -585,6 +755,9 @@
         </w:numPr>
       </w:pPr>
       <w:r>
+        <w:rPr>
+          <w:lang w:val="en"/>
+        </w:rPr>
         <w:t xml:space="preserve">Trello, Notion, Jira</w:t>
       </w:r>
     </w:p>
@@ -597,6 +770,9 @@
         </w:numPr>
       </w:pPr>
       <w:r>
+        <w:rPr>
+          <w:lang w:val="en"/>
+        </w:rPr>
         <w:t xml:space="preserve">Slack, Discord, WhatsApp, MS Teams</w:t>
       </w:r>
     </w:p>
@@ -608,6 +784,9 @@
         <w:pStyle w:val="Heading2"/>
       </w:pPr>
       <w:r>
+        <w:rPr>
+          <w:lang w:val="en"/>
+        </w:rPr>
         <w:t xml:space="preserve">EXPERIENCE</w:t>
       </w:r>
     </w:p>
@@ -623,6 +802,9 @@
         <w:pStyle w:val="FirstParagraph"/>
       </w:pPr>
       <w:r>
+        <w:rPr>
+          <w:lang w:val="en"/>
+        </w:rPr>
         <w:t xml:space="preserve">Open Source Miner &amp; Contributor</w:t>
       </w:r>
     </w:p>
@@ -631,6 +813,9 @@
         <w:pStyle w:val="BodyText"/>
       </w:pPr>
       <w:r>
+        <w:rPr>
+          <w:lang w:val="en"/>
+        </w:rPr>
         <w:t xml:space="preserve">2026.4 - Present</w:t>
       </w:r>
     </w:p>
@@ -639,6 +824,9 @@
         <w:pStyle w:val="BodyText"/>
       </w:pPr>
       <w:r>
+        <w:rPr>
+          <w:lang w:val="en"/>
+        </w:rPr>
         <w:t xml:space="preserve">Bittensor Network - SN74 Gittensor</w:t>
       </w:r>
     </w:p>
@@ -651,6 +839,9 @@
         </w:numPr>
       </w:pPr>
       <w:r>
+        <w:rPr>
+          <w:lang w:val="en"/>
+        </w:rPr>
         <w:t xml:space="preserve">Mining on Bittensor's SN74 Gittensor subnet by contributing merged PRs to whitelisted open source repositories, earning TAO alpha token emissions based on code quality and credibility scores.</w:t>
       </w:r>
     </w:p>
@@ -663,36 +854,56 @@
         </w:numPr>
       </w:pPr>
       <w:r>
+        <w:rPr>
+          <w:lang w:val="en"/>
+        </w:rPr>
         <w:t xml:space="preserve">Contributed bug fixes and feature improvements to hot repositories —</w:t>
       </w:r>
       <w:r>
+        <w:rPr>
+          <w:lang w:val="en"/>
+        </w:rPr>
         <w:t xml:space="preserve"> </w:t>
       </w:r>
       <w:r>
         <w:rPr>
           <w:b/>
           <w:bCs/>
-        </w:rPr>
-        <w:t xml:space="preserve">18 merged PRs across Sure v0.7.1–v0.7.4</w:t>
-      </w:r>
-      <w:r>
+          <w:lang w:val="en"/>
+        </w:rPr>
+        <w:t xml:space="preserve">20 merged PRs across Sure v0.7.1–v0.7.5</w:t>
+      </w:r>
+      <w:r>
+        <w:rPr>
+          <w:lang w:val="en"/>
+        </w:rPr>
         <w:t xml:space="preserve">, ranking</w:t>
       </w:r>
       <w:r>
+        <w:rPr>
+          <w:lang w:val="en"/>
+        </w:rPr>
         <w:t xml:space="preserve"> </w:t>
       </w:r>
       <w:r>
         <w:rPr>
           <w:b/>
           <w:bCs/>
+          <w:lang w:val="en"/>
         </w:rPr>
         <w:t xml:space="preserve">#11</w:t>
       </w:r>
       <w:r>
+        <w:rPr>
+          <w:lang w:val="en"/>
+        </w:rPr>
         <w:t xml:space="preserve"> </w:t>
       </w:r>
       <w:r>
-        <w:t xml:space="preserve">on the Gittensor leaderboard for v0.7.4 with 11 merged PRs (transfer tags, transaction rule operators, N+1 query fixes, Design System &amp; i18n cleanups).</w:t>
+        <w:rPr>
+          <w:lang w:val="en"/>
+        </w:rPr>
+        <w:t xml:space="preserve">on the Gittensor leaderboard for v0.7.4 (11 PRs), plus v0.7.5 investment portfolio-weight rollups and an EODHD Warsaw price-currency fix with data backfill.</w:t>
       </w:r>
     </w:p>
     <w:p>
@@ -704,6 +915,9 @@
         </w:numPr>
       </w:pPr>
       <w:r>
+        <w:rPr>
+          <w:lang w:val="en"/>
+        </w:rPr>
         <w:t xml:space="preserve">Managed Bittensor wallet infrastructure using btcli, including coldkey/hotkey configuration, TAO deposits, and subnet registration on the Bittensor mainnet.</w:t>
       </w:r>
     </w:p>
@@ -712,6 +926,9 @@
         <w:pStyle w:val="FirstParagraph"/>
       </w:pPr>
       <w:r>
+        <w:rPr>
+          <w:lang w:val="en"/>
+        </w:rPr>
         <w:t xml:space="preserve">Senior AI Backend Engineer</w:t>
       </w:r>
     </w:p>
@@ -720,6 +937,9 @@
         <w:pStyle w:val="BodyText"/>
       </w:pPr>
       <w:r>
+        <w:rPr>
+          <w:lang w:val="en"/>
+        </w:rPr>
         <w:t xml:space="preserve">2025 - 2026</w:t>
       </w:r>
     </w:p>
@@ -728,6 +948,9 @@
         <w:pStyle w:val="BodyText"/>
       </w:pPr>
       <w:r>
+        <w:rPr>
+          <w:lang w:val="en"/>
+        </w:rPr>
         <w:t xml:space="preserve">ABC Digital Solutions Sdn Bhd</w:t>
       </w:r>
     </w:p>
@@ -736,6 +959,9 @@
         <w:pStyle w:val="BodyText"/>
       </w:pPr>
       <w:r>
+        <w:rPr>
+          <w:lang w:val="en"/>
+        </w:rPr>
         <w:t xml:space="preserve">Malaysia</w:t>
       </w:r>
     </w:p>
@@ -748,6 +974,9 @@
         </w:numPr>
       </w:pPr>
       <w:r>
+        <w:rPr>
+          <w:lang w:val="en"/>
+        </w:rPr>
         <w:t xml:space="preserve">Designed and developed AI-powered backend services using Python, FastAPI, and LangChain.</w:t>
       </w:r>
     </w:p>
@@ -760,6 +989,9 @@
         </w:numPr>
       </w:pPr>
       <w:r>
+        <w:rPr>
+          <w:lang w:val="en"/>
+        </w:rPr>
         <w:t xml:space="preserve">Implemented Retrieval-Augmented Generation (RAG) solutions utilizing vector databases and large language models.</w:t>
       </w:r>
     </w:p>
@@ -772,6 +1004,9 @@
         </w:numPr>
       </w:pPr>
       <w:r>
+        <w:rPr>
+          <w:lang w:val="en"/>
+        </w:rPr>
         <w:t xml:space="preserve">Built scalable microservices architecture deployed on AWS using Docker and Kubernetes.</w:t>
       </w:r>
     </w:p>
@@ -780,6 +1015,9 @@
         <w:pStyle w:val="FirstParagraph"/>
       </w:pPr>
       <w:r>
+        <w:rPr>
+          <w:lang w:val="en"/>
+        </w:rPr>
         <w:t xml:space="preserve">Senior AI Backend Engineer</w:t>
       </w:r>
     </w:p>
@@ -788,6 +1026,9 @@
         <w:pStyle w:val="BodyText"/>
       </w:pPr>
       <w:r>
+        <w:rPr>
+          <w:lang w:val="en"/>
+        </w:rPr>
         <w:t xml:space="preserve">2024.1 - 2025.3</w:t>
       </w:r>
     </w:p>
@@ -796,6 +1037,9 @@
         <w:pStyle w:val="BodyText"/>
       </w:pPr>
       <w:r>
+        <w:rPr>
+          <w:lang w:val="en"/>
+        </w:rPr>
         <w:t xml:space="preserve">ABC Digital Solutions Sdn Bhd</w:t>
       </w:r>
     </w:p>
@@ -804,6 +1048,9 @@
         <w:pStyle w:val="BodyText"/>
       </w:pPr>
       <w:r>
+        <w:rPr>
+          <w:lang w:val="en"/>
+        </w:rPr>
         <w:t xml:space="preserve">Malaysia</w:t>
       </w:r>
     </w:p>
@@ -816,6 +1063,9 @@
         </w:numPr>
       </w:pPr>
       <w:r>
+        <w:rPr>
+          <w:lang w:val="en"/>
+        </w:rPr>
         <w:t xml:space="preserve">Developed secure RESTful APIs supporting over 500,000 monthly transactions.</w:t>
       </w:r>
     </w:p>
@@ -828,6 +1078,9 @@
         </w:numPr>
       </w:pPr>
       <w:r>
+        <w:rPr>
+          <w:lang w:val="en"/>
+        </w:rPr>
         <w:t xml:space="preserve">Optimized backend performance, reducing API response times by 40%.</w:t>
       </w:r>
     </w:p>
@@ -840,6 +1093,9 @@
         </w:numPr>
       </w:pPr>
       <w:r>
+        <w:rPr>
+          <w:lang w:val="en"/>
+        </w:rPr>
         <w:t xml:space="preserve">Integrated OpenAI and enterprise AI models into customer-facing applications.</w:t>
       </w:r>
     </w:p>
@@ -852,6 +1108,9 @@
         </w:numPr>
       </w:pPr>
       <w:r>
+        <w:rPr>
+          <w:lang w:val="en"/>
+        </w:rPr>
         <w:t xml:space="preserve">Led a team of 6 engineers delivering AI automation projects across finance and e-commerce sectors.</w:t>
       </w:r>
     </w:p>
@@ -860,6 +1119,9 @@
         <w:pStyle w:val="FirstParagraph"/>
       </w:pPr>
       <w:r>
+        <w:rPr>
+          <w:lang w:val="en"/>
+        </w:rPr>
         <w:t xml:space="preserve">Backend Software Engineer (Remote)</w:t>
       </w:r>
     </w:p>
@@ -868,6 +1130,9 @@
         <w:pStyle w:val="BodyText"/>
       </w:pPr>
       <w:r>
+        <w:rPr>
+          <w:lang w:val="en"/>
+        </w:rPr>
         <w:t xml:space="preserve">2021.1 - 2023.12</w:t>
       </w:r>
     </w:p>
@@ -876,6 +1141,9 @@
         <w:pStyle w:val="BodyText"/>
       </w:pPr>
       <w:r>
+        <w:rPr>
+          <w:lang w:val="en"/>
+        </w:rPr>
         <w:t xml:space="preserve">TechVision Systems Sdn Bhd</w:t>
       </w:r>
     </w:p>
@@ -884,6 +1152,9 @@
         <w:pStyle w:val="BodyText"/>
       </w:pPr>
       <w:r>
+        <w:rPr>
+          <w:lang w:val="en"/>
+        </w:rPr>
         <w:t xml:space="preserve">Malaysia</w:t>
       </w:r>
     </w:p>
@@ -896,6 +1167,9 @@
         </w:numPr>
       </w:pPr>
       <w:r>
+        <w:rPr>
+          <w:lang w:val="en"/>
+        </w:rPr>
         <w:t xml:space="preserve">Developed enterprise backend systems using Java Spring Boot and PostgreSQL.</w:t>
       </w:r>
     </w:p>
@@ -908,6 +1182,9 @@
         </w:numPr>
       </w:pPr>
       <w:r>
+        <w:rPr>
+          <w:lang w:val="en"/>
+        </w:rPr>
         <w:t xml:space="preserve">Designed microservices and event-driven architectures supporting high-volume transactions.</w:t>
       </w:r>
     </w:p>
@@ -920,6 +1197,9 @@
         </w:numPr>
       </w:pPr>
       <w:r>
+        <w:rPr>
+          <w:lang w:val="en"/>
+        </w:rPr>
         <w:t xml:space="preserve">Built API integrations with payment gateways, ERP systems, and third-party platforms.</w:t>
       </w:r>
     </w:p>
@@ -932,6 +1212,9 @@
         </w:numPr>
       </w:pPr>
       <w:r>
+        <w:rPr>
+          <w:lang w:val="en"/>
+        </w:rPr>
         <w:t xml:space="preserve">Implemented CI/CD pipelines using Jenkins, Docker, and GitLab; reduced infrastructure costs by 25% via containerization.</w:t>
       </w:r>
     </w:p>
@@ -940,6 +1223,9 @@
         <w:pStyle w:val="FirstParagraph"/>
       </w:pPr>
       <w:r>
+        <w:rPr>
+          <w:lang w:val="en"/>
+        </w:rPr>
         <w:t xml:space="preserve">Software Engineer (Remote)</w:t>
       </w:r>
     </w:p>
@@ -948,6 +1234,9 @@
         <w:pStyle w:val="BodyText"/>
       </w:pPr>
       <w:r>
+        <w:rPr>
+          <w:lang w:val="en"/>
+        </w:rPr>
         <w:t xml:space="preserve">2018.6 - 2020.12</w:t>
       </w:r>
     </w:p>
@@ -956,6 +1245,9 @@
         <w:pStyle w:val="BodyText"/>
       </w:pPr>
       <w:r>
+        <w:rPr>
+          <w:lang w:val="en"/>
+        </w:rPr>
         <w:t xml:space="preserve">Innovate Technologies, Inc.</w:t>
       </w:r>
     </w:p>
@@ -964,6 +1256,9 @@
         <w:pStyle w:val="BodyText"/>
       </w:pPr>
       <w:r>
+        <w:rPr>
+          <w:lang w:val="en"/>
+        </w:rPr>
         <w:t xml:space="preserve">Malaysia</w:t>
       </w:r>
     </w:p>
@@ -976,6 +1271,9 @@
         </w:numPr>
       </w:pPr>
       <w:r>
+        <w:rPr>
+          <w:lang w:val="en"/>
+        </w:rPr>
         <w:t xml:space="preserve">Developed web applications and backend services using Python, Node.js, and MySQL.</w:t>
       </w:r>
     </w:p>
@@ -988,6 +1286,9 @@
         </w:numPr>
       </w:pPr>
       <w:r>
+        <w:rPr>
+          <w:lang w:val="en"/>
+        </w:rPr>
         <w:t xml:space="preserve">Created REST APIs for mobile and web applications; built reporting and analytics modules for BI platforms.</w:t>
       </w:r>
     </w:p>
@@ -1000,6 +1301,9 @@
         </w:numPr>
       </w:pPr>
       <w:r>
+        <w:rPr>
+          <w:lang w:val="en"/>
+        </w:rPr>
         <w:t xml:space="preserve">Automated manual workflows, improving operational efficiency by 30%; maintained security, DB performance, and availability.</w:t>
       </w:r>
     </w:p>
@@ -1008,6 +1312,9 @@
         <w:pStyle w:val="FirstParagraph"/>
       </w:pPr>
       <w:r>
+        <w:rPr>
+          <w:lang w:val="en"/>
+        </w:rPr>
         <w:t xml:space="preserve">Freelance Web Developer</w:t>
       </w:r>
     </w:p>
@@ -1016,6 +1323,9 @@
         <w:pStyle w:val="BodyText"/>
       </w:pPr>
       <w:r>
+        <w:rPr>
+          <w:lang w:val="en"/>
+        </w:rPr>
         <w:t xml:space="preserve">2017.9 - 2018.5</w:t>
       </w:r>
     </w:p>
@@ -1024,6 +1334,9 @@
         <w:pStyle w:val="BodyText"/>
       </w:pPr>
       <w:r>
+        <w:rPr>
+          <w:lang w:val="en"/>
+        </w:rPr>
         <w:t xml:space="preserve">CrowdWorks.jp</w:t>
       </w:r>
     </w:p>
@@ -1032,6 +1345,9 @@
         <w:pStyle w:val="BodyText"/>
       </w:pPr>
       <w:r>
+        <w:rPr>
+          <w:lang w:val="en"/>
+        </w:rPr>
         <w:t xml:space="preserve">Japan</w:t>
       </w:r>
     </w:p>
@@ -1044,19 +1360,29 @@
         </w:numPr>
       </w:pPr>
       <w:r>
+        <w:rPr>
+          <w:lang w:val="en"/>
+        </w:rPr>
         <w:t xml:space="preserve">Developed and delivered custom web applications for Japanese clients through</w:t>
       </w:r>
       <w:r>
+        <w:rPr>
+          <w:lang w:val="en"/>
+        </w:rPr>
         <w:t xml:space="preserve"> </w:t>
       </w:r>
       <w:r>
         <w:rPr>
           <w:b/>
           <w:bCs/>
+          <w:lang w:val="en"/>
         </w:rPr>
         <w:t xml:space="preserve">CrowdWorks.jp</w:t>
       </w:r>
       <w:r>
+        <w:rPr>
+          <w:lang w:val="en"/>
+        </w:rPr>
         <w:t xml:space="preserve">, focusing on responsive UI and performance optimization.</w:t>
       </w:r>
     </w:p>
@@ -1069,6 +1395,9 @@
         </w:numPr>
       </w:pPr>
       <w:r>
+        <w:rPr>
+          <w:lang w:val="en"/>
+        </w:rPr>
         <w:t xml:space="preserve">Collaborated remotely with Japanese clients to translate business requirements into scalable technical solutions.</w:t>
       </w:r>
     </w:p>
@@ -1081,6 +1410,9 @@
         </w:numPr>
       </w:pPr>
       <w:r>
+        <w:rPr>
+          <w:lang w:val="en"/>
+        </w:rPr>
         <w:t xml:space="preserve">Successfully completed multiple freelance projects (Fixed and Hourly) while maintaining high client satisfaction and meeting strict deadlines.</w:t>
       </w:r>
     </w:p>
@@ -1089,6 +1421,9 @@
         <w:pStyle w:val="FirstParagraph"/>
       </w:pPr>
       <w:r>
+        <w:rPr>
+          <w:lang w:val="en"/>
+        </w:rPr>
         <w:t xml:space="preserve">Junior Freelance Web Developer</w:t>
       </w:r>
     </w:p>
@@ -1097,6 +1432,9 @@
         <w:pStyle w:val="BodyText"/>
       </w:pPr>
       <w:r>
+        <w:rPr>
+          <w:lang w:val="en"/>
+        </w:rPr>
         <w:t xml:space="preserve">2015.11 - 2017.7</w:t>
       </w:r>
     </w:p>
@@ -1105,6 +1443,9 @@
         <w:pStyle w:val="BodyText"/>
       </w:pPr>
       <w:r>
+        <w:rPr>
+          <w:lang w:val="en"/>
+        </w:rPr>
         <w:t xml:space="preserve">Upwork.com</w:t>
       </w:r>
     </w:p>
@@ -1113,6 +1454,9 @@
         <w:pStyle w:val="BodyText"/>
       </w:pPr>
       <w:r>
+        <w:rPr>
+          <w:lang w:val="en"/>
+        </w:rPr>
         <w:t xml:space="preserve">United States</w:t>
       </w:r>
     </w:p>
@@ -1125,19 +1469,29 @@
         </w:numPr>
       </w:pPr>
       <w:r>
+        <w:rPr>
+          <w:lang w:val="en"/>
+        </w:rPr>
         <w:t xml:space="preserve">Worked as a junior freelancer on</w:t>
       </w:r>
       <w:r>
+        <w:rPr>
+          <w:lang w:val="en"/>
+        </w:rPr>
         <w:t xml:space="preserve"> </w:t>
       </w:r>
       <w:r>
         <w:rPr>
           <w:b/>
           <w:bCs/>
+          <w:lang w:val="en"/>
         </w:rPr>
         <w:t xml:space="preserve">Upwork.com</w:t>
       </w:r>
       <w:r>
+        <w:rPr>
+          <w:lang w:val="en"/>
+        </w:rPr>
         <w:t xml:space="preserve">, contributing to website development, bug fixing, and UI enhancements across multiple client projects.</w:t>
       </w:r>
     </w:p>
@@ -1150,6 +1504,9 @@
         </w:numPr>
       </w:pPr>
       <w:r>
+        <w:rPr>
+          <w:lang w:val="en"/>
+        </w:rPr>
         <w:t xml:space="preserve">Assisted in translating client ideas into functional web solutions using the MEAN stack; gained experience in remote collaboration and agile practices.</w:t>
       </w:r>
     </w:p>
@@ -1160,6 +1517,9 @@
         <w:pStyle w:val="Heading2"/>
       </w:pPr>
       <w:r>
+        <w:rPr>
+          <w:lang w:val="en"/>
+        </w:rPr>
         <w:t xml:space="preserve">EDUCATION</w:t>
       </w:r>
     </w:p>
@@ -1175,6 +1535,9 @@
         <w:pStyle w:val="FirstParagraph"/>
       </w:pPr>
       <w:r>
+        <w:rPr>
+          <w:lang w:val="en"/>
+        </w:rPr>
         <w:t xml:space="preserve">Bachelor of Science (Hons) in Computer Science</w:t>
       </w:r>
     </w:p>
@@ -1183,6 +1546,9 @@
         <w:pStyle w:val="BodyText"/>
       </w:pPr>
       <w:r>
+        <w:rPr>
+          <w:lang w:val="en"/>
+        </w:rPr>
         <w:t xml:space="preserve">University Malaysia of Computer Science &amp; Engineering (UNIMY)</w:t>
       </w:r>
     </w:p>
@@ -1191,6 +1557,9 @@
         <w:pStyle w:val="BodyText"/>
       </w:pPr>
       <w:r>
+        <w:rPr>
+          <w:lang w:val="en"/>
+        </w:rPr>
         <w:t xml:space="preserve">2012 - 2015</w:t>
       </w:r>
     </w:p>

</xml_diff>